<commit_message>
docs(manual): documenta el control de combustible y los indicadores de logistica
- Manual de usuario: nivel del tanque al salir y al llegar, facturas de
  combustible, alertas "Revisar combustible", seccion Combustible del detalle,
  pestana Indicadores, tarjeta Logistica del mes, capacidad del tanque en
  Vehiculos y fecha de entrega obligatoria (capturas nuevas).
- Manual tecnico: JWT_SECRET obligatoria, migracion 2026-10-23, capacidad del
  tanque en catalogos y parametros, y dos casos de solucion de problemas.

Co-Authored-By: Claude Opus 5.5 <noreply@anthropic.com>
</commit_message>
<xml_diff>
--- a/docs/A_Manual_Tecnico/Manual_Tecnico.docx
+++ b/docs/A_Manual_Tecnico/Manual_Tecnico.docx
@@ -107,7 +107,7 @@
       <w:r>
         <w:fldChar w:fldCharType="separate"/>
       </w:r>
-      <w:hyperlink w:anchor="_Toc243590842" w:history="1">
+      <w:hyperlink w:anchor="_Toc243688679" w:history="1">
         <w:r>
           <w:rPr>
             <w:rStyle w:val="Hyperlink"/>
@@ -134,7 +134,7 @@
             <w:noProof/>
             <w:webHidden/>
           </w:rPr>
-          <w:instrText xml:space="preserve"> PAGEREF _Toc243590842 \h </w:instrText>
+          <w:instrText xml:space="preserve"> PAGEREF _Toc243688679 \h </w:instrText>
         </w:r>
         <w:r>
           <w:rPr>
@@ -180,7 +180,7 @@
           <w14:ligatures w14:val="standardContextual"/>
         </w:rPr>
       </w:pPr>
-      <w:hyperlink w:anchor="_Toc243590843" w:history="1">
+      <w:hyperlink w:anchor="_Toc243688680" w:history="1">
         <w:r>
           <w:rPr>
             <w:rStyle w:val="Hyperlink"/>
@@ -207,7 +207,7 @@
             <w:noProof/>
             <w:webHidden/>
           </w:rPr>
-          <w:instrText xml:space="preserve"> PAGEREF _Toc243590843 \h </w:instrText>
+          <w:instrText xml:space="preserve"> PAGEREF _Toc243688680 \h </w:instrText>
         </w:r>
         <w:r>
           <w:rPr>
@@ -253,7 +253,7 @@
           <w14:ligatures w14:val="standardContextual"/>
         </w:rPr>
       </w:pPr>
-      <w:hyperlink w:anchor="_Toc243590844" w:history="1">
+      <w:hyperlink w:anchor="_Toc243688681" w:history="1">
         <w:r>
           <w:rPr>
             <w:rStyle w:val="Hyperlink"/>
@@ -280,7 +280,7 @@
             <w:noProof/>
             <w:webHidden/>
           </w:rPr>
-          <w:instrText xml:space="preserve"> PAGEREF _Toc243590844 \h </w:instrText>
+          <w:instrText xml:space="preserve"> PAGEREF _Toc243688681 \h </w:instrText>
         </w:r>
         <w:r>
           <w:rPr>
@@ -326,7 +326,7 @@
           <w14:ligatures w14:val="standardContextual"/>
         </w:rPr>
       </w:pPr>
-      <w:hyperlink w:anchor="_Toc243590845" w:history="1">
+      <w:hyperlink w:anchor="_Toc243688682" w:history="1">
         <w:r>
           <w:rPr>
             <w:rStyle w:val="Hyperlink"/>
@@ -353,7 +353,7 @@
             <w:noProof/>
             <w:webHidden/>
           </w:rPr>
-          <w:instrText xml:space="preserve"> PAGEREF _Toc243590845 \h </w:instrText>
+          <w:instrText xml:space="preserve"> PAGEREF _Toc243688682 \h </w:instrText>
         </w:r>
         <w:r>
           <w:rPr>
@@ -399,7 +399,7 @@
           <w14:ligatures w14:val="standardContextual"/>
         </w:rPr>
       </w:pPr>
-      <w:hyperlink w:anchor="_Toc243590846" w:history="1">
+      <w:hyperlink w:anchor="_Toc243688683" w:history="1">
         <w:r>
           <w:rPr>
             <w:rStyle w:val="Hyperlink"/>
@@ -426,7 +426,7 @@
             <w:noProof/>
             <w:webHidden/>
           </w:rPr>
-          <w:instrText xml:space="preserve"> PAGEREF _Toc243590846 \h </w:instrText>
+          <w:instrText xml:space="preserve"> PAGEREF _Toc243688683 \h </w:instrText>
         </w:r>
         <w:r>
           <w:rPr>
@@ -472,7 +472,7 @@
           <w14:ligatures w14:val="standardContextual"/>
         </w:rPr>
       </w:pPr>
-      <w:hyperlink w:anchor="_Toc243590847" w:history="1">
+      <w:hyperlink w:anchor="_Toc243688684" w:history="1">
         <w:r>
           <w:rPr>
             <w:rStyle w:val="Hyperlink"/>
@@ -499,7 +499,7 @@
             <w:noProof/>
             <w:webHidden/>
           </w:rPr>
-          <w:instrText xml:space="preserve"> PAGEREF _Toc243590847 \h </w:instrText>
+          <w:instrText xml:space="preserve"> PAGEREF _Toc243688684 \h </w:instrText>
         </w:r>
         <w:r>
           <w:rPr>
@@ -545,7 +545,7 @@
           <w14:ligatures w14:val="standardContextual"/>
         </w:rPr>
       </w:pPr>
-      <w:hyperlink w:anchor="_Toc243590848" w:history="1">
+      <w:hyperlink w:anchor="_Toc243688685" w:history="1">
         <w:r>
           <w:rPr>
             <w:rStyle w:val="Hyperlink"/>
@@ -572,7 +572,7 @@
             <w:noProof/>
             <w:webHidden/>
           </w:rPr>
-          <w:instrText xml:space="preserve"> PAGEREF _Toc243590848 \h </w:instrText>
+          <w:instrText xml:space="preserve"> PAGEREF _Toc243688685 \h </w:instrText>
         </w:r>
         <w:r>
           <w:rPr>
@@ -618,7 +618,7 @@
           <w14:ligatures w14:val="standardContextual"/>
         </w:rPr>
       </w:pPr>
-      <w:hyperlink w:anchor="_Toc243590849" w:history="1">
+      <w:hyperlink w:anchor="_Toc243688686" w:history="1">
         <w:r>
           <w:rPr>
             <w:rStyle w:val="Hyperlink"/>
@@ -645,7 +645,7 @@
             <w:noProof/>
             <w:webHidden/>
           </w:rPr>
-          <w:instrText xml:space="preserve"> PAGEREF _Toc243590849 \h </w:instrText>
+          <w:instrText xml:space="preserve"> PAGEREF _Toc243688686 \h </w:instrText>
         </w:r>
         <w:r>
           <w:rPr>
@@ -691,7 +691,7 @@
           <w14:ligatures w14:val="standardContextual"/>
         </w:rPr>
       </w:pPr>
-      <w:hyperlink w:anchor="_Toc243590850" w:history="1">
+      <w:hyperlink w:anchor="_Toc243688687" w:history="1">
         <w:r>
           <w:rPr>
             <w:rStyle w:val="Hyperlink"/>
@@ -718,7 +718,7 @@
             <w:noProof/>
             <w:webHidden/>
           </w:rPr>
-          <w:instrText xml:space="preserve"> PAGEREF _Toc243590850 \h </w:instrText>
+          <w:instrText xml:space="preserve"> PAGEREF _Toc243688687 \h </w:instrText>
         </w:r>
         <w:r>
           <w:rPr>
@@ -764,7 +764,7 @@
           <w14:ligatures w14:val="standardContextual"/>
         </w:rPr>
       </w:pPr>
-      <w:hyperlink w:anchor="_Toc243590851" w:history="1">
+      <w:hyperlink w:anchor="_Toc243688688" w:history="1">
         <w:r>
           <w:rPr>
             <w:rStyle w:val="Hyperlink"/>
@@ -791,7 +791,7 @@
             <w:noProof/>
             <w:webHidden/>
           </w:rPr>
-          <w:instrText xml:space="preserve"> PAGEREF _Toc243590851 \h </w:instrText>
+          <w:instrText xml:space="preserve"> PAGEREF _Toc243688688 \h </w:instrText>
         </w:r>
         <w:r>
           <w:rPr>
@@ -837,7 +837,7 @@
           <w14:ligatures w14:val="standardContextual"/>
         </w:rPr>
       </w:pPr>
-      <w:hyperlink w:anchor="_Toc243590852" w:history="1">
+      <w:hyperlink w:anchor="_Toc243688689" w:history="1">
         <w:r>
           <w:rPr>
             <w:rStyle w:val="Hyperlink"/>
@@ -864,7 +864,7 @@
             <w:noProof/>
             <w:webHidden/>
           </w:rPr>
-          <w:instrText xml:space="preserve"> PAGEREF _Toc243590852 \h </w:instrText>
+          <w:instrText xml:space="preserve"> PAGEREF _Toc243688689 \h </w:instrText>
         </w:r>
         <w:r>
           <w:rPr>
@@ -910,7 +910,7 @@
           <w14:ligatures w14:val="standardContextual"/>
         </w:rPr>
       </w:pPr>
-      <w:hyperlink w:anchor="_Toc243590853" w:history="1">
+      <w:hyperlink w:anchor="_Toc243688690" w:history="1">
         <w:r>
           <w:rPr>
             <w:rStyle w:val="Hyperlink"/>
@@ -937,7 +937,7 @@
             <w:noProof/>
             <w:webHidden/>
           </w:rPr>
-          <w:instrText xml:space="preserve"> PAGEREF _Toc243590853 \h </w:instrText>
+          <w:instrText xml:space="preserve"> PAGEREF _Toc243688690 \h </w:instrText>
         </w:r>
         <w:r>
           <w:rPr>
@@ -983,7 +983,7 @@
           <w14:ligatures w14:val="standardContextual"/>
         </w:rPr>
       </w:pPr>
-      <w:hyperlink w:anchor="_Toc243590854" w:history="1">
+      <w:hyperlink w:anchor="_Toc243688691" w:history="1">
         <w:r>
           <w:rPr>
             <w:rStyle w:val="Hyperlink"/>
@@ -1010,7 +1010,7 @@
             <w:noProof/>
             <w:webHidden/>
           </w:rPr>
-          <w:instrText xml:space="preserve"> PAGEREF _Toc243590854 \h </w:instrText>
+          <w:instrText xml:space="preserve"> PAGEREF _Toc243688691 \h </w:instrText>
         </w:r>
         <w:r>
           <w:rPr>
@@ -1056,7 +1056,7 @@
           <w14:ligatures w14:val="standardContextual"/>
         </w:rPr>
       </w:pPr>
-      <w:hyperlink w:anchor="_Toc243590855" w:history="1">
+      <w:hyperlink w:anchor="_Toc243688692" w:history="1">
         <w:r>
           <w:rPr>
             <w:rStyle w:val="Hyperlink"/>
@@ -1083,7 +1083,7 @@
             <w:noProof/>
             <w:webHidden/>
           </w:rPr>
-          <w:instrText xml:space="preserve"> PAGEREF _Toc243590855 \h </w:instrText>
+          <w:instrText xml:space="preserve"> PAGEREF _Toc243688692 \h </w:instrText>
         </w:r>
         <w:r>
           <w:rPr>
@@ -1129,7 +1129,7 @@
           <w14:ligatures w14:val="standardContextual"/>
         </w:rPr>
       </w:pPr>
-      <w:hyperlink w:anchor="_Toc243590856" w:history="1">
+      <w:hyperlink w:anchor="_Toc243688693" w:history="1">
         <w:r>
           <w:rPr>
             <w:rStyle w:val="Hyperlink"/>
@@ -1156,7 +1156,7 @@
             <w:noProof/>
             <w:webHidden/>
           </w:rPr>
-          <w:instrText xml:space="preserve"> PAGEREF _Toc243590856 \h </w:instrText>
+          <w:instrText xml:space="preserve"> PAGEREF _Toc243688693 \h </w:instrText>
         </w:r>
         <w:r>
           <w:rPr>
@@ -1202,7 +1202,7 @@
           <w14:ligatures w14:val="standardContextual"/>
         </w:rPr>
       </w:pPr>
-      <w:hyperlink w:anchor="_Toc243590857" w:history="1">
+      <w:hyperlink w:anchor="_Toc243688694" w:history="1">
         <w:r>
           <w:rPr>
             <w:rStyle w:val="Hyperlink"/>
@@ -1229,7 +1229,7 @@
             <w:noProof/>
             <w:webHidden/>
           </w:rPr>
-          <w:instrText xml:space="preserve"> PAGEREF _Toc243590857 \h </w:instrText>
+          <w:instrText xml:space="preserve"> PAGEREF _Toc243688694 \h </w:instrText>
         </w:r>
         <w:r>
           <w:rPr>
@@ -1275,7 +1275,7 @@
           <w14:ligatures w14:val="standardContextual"/>
         </w:rPr>
       </w:pPr>
-      <w:hyperlink w:anchor="_Toc243590858" w:history="1">
+      <w:hyperlink w:anchor="_Toc243688695" w:history="1">
         <w:r>
           <w:rPr>
             <w:rStyle w:val="Hyperlink"/>
@@ -1302,7 +1302,7 @@
             <w:noProof/>
             <w:webHidden/>
           </w:rPr>
-          <w:instrText xml:space="preserve"> PAGEREF _Toc243590858 \h </w:instrText>
+          <w:instrText xml:space="preserve"> PAGEREF _Toc243688695 \h </w:instrText>
         </w:r>
         <w:r>
           <w:rPr>
@@ -1348,7 +1348,7 @@
           <w14:ligatures w14:val="standardContextual"/>
         </w:rPr>
       </w:pPr>
-      <w:hyperlink w:anchor="_Toc243590859" w:history="1">
+      <w:hyperlink w:anchor="_Toc243688696" w:history="1">
         <w:r>
           <w:rPr>
             <w:rStyle w:val="Hyperlink"/>
@@ -1375,7 +1375,7 @@
             <w:noProof/>
             <w:webHidden/>
           </w:rPr>
-          <w:instrText xml:space="preserve"> PAGEREF _Toc243590859 \h </w:instrText>
+          <w:instrText xml:space="preserve"> PAGEREF _Toc243688696 \h </w:instrText>
         </w:r>
         <w:r>
           <w:rPr>
@@ -1421,7 +1421,7 @@
           <w14:ligatures w14:val="standardContextual"/>
         </w:rPr>
       </w:pPr>
-      <w:hyperlink w:anchor="_Toc243590860" w:history="1">
+      <w:hyperlink w:anchor="_Toc243688697" w:history="1">
         <w:r>
           <w:rPr>
             <w:rStyle w:val="Hyperlink"/>
@@ -1448,7 +1448,7 @@
             <w:noProof/>
             <w:webHidden/>
           </w:rPr>
-          <w:instrText xml:space="preserve"> PAGEREF _Toc243590860 \h </w:instrText>
+          <w:instrText xml:space="preserve"> PAGEREF _Toc243688697 \h </w:instrText>
         </w:r>
         <w:r>
           <w:rPr>
@@ -1494,7 +1494,7 @@
           <w14:ligatures w14:val="standardContextual"/>
         </w:rPr>
       </w:pPr>
-      <w:hyperlink w:anchor="_Toc243590861" w:history="1">
+      <w:hyperlink w:anchor="_Toc243688698" w:history="1">
         <w:r>
           <w:rPr>
             <w:rStyle w:val="Hyperlink"/>
@@ -1521,7 +1521,7 @@
             <w:noProof/>
             <w:webHidden/>
           </w:rPr>
-          <w:instrText xml:space="preserve"> PAGEREF _Toc243590861 \h </w:instrText>
+          <w:instrText xml:space="preserve"> PAGEREF _Toc243688698 \h </w:instrText>
         </w:r>
         <w:r>
           <w:rPr>
@@ -1567,7 +1567,7 @@
           <w14:ligatures w14:val="standardContextual"/>
         </w:rPr>
       </w:pPr>
-      <w:hyperlink w:anchor="_Toc243590862" w:history="1">
+      <w:hyperlink w:anchor="_Toc243688699" w:history="1">
         <w:r>
           <w:rPr>
             <w:rStyle w:val="Hyperlink"/>
@@ -1594,7 +1594,7 @@
             <w:noProof/>
             <w:webHidden/>
           </w:rPr>
-          <w:instrText xml:space="preserve"> PAGEREF _Toc243590862 \h </w:instrText>
+          <w:instrText xml:space="preserve"> PAGEREF _Toc243688699 \h </w:instrText>
         </w:r>
         <w:r>
           <w:rPr>
@@ -1640,7 +1640,7 @@
           <w14:ligatures w14:val="standardContextual"/>
         </w:rPr>
       </w:pPr>
-      <w:hyperlink w:anchor="_Toc243590863" w:history="1">
+      <w:hyperlink w:anchor="_Toc243688700" w:history="1">
         <w:r>
           <w:rPr>
             <w:rStyle w:val="Hyperlink"/>
@@ -1667,7 +1667,7 @@
             <w:noProof/>
             <w:webHidden/>
           </w:rPr>
-          <w:instrText xml:space="preserve"> PAGEREF _Toc243590863 \h </w:instrText>
+          <w:instrText xml:space="preserve"> PAGEREF _Toc243688700 \h </w:instrText>
         </w:r>
         <w:r>
           <w:rPr>
@@ -1713,7 +1713,7 @@
           <w14:ligatures w14:val="standardContextual"/>
         </w:rPr>
       </w:pPr>
-      <w:hyperlink w:anchor="_Toc243590864" w:history="1">
+      <w:hyperlink w:anchor="_Toc243688701" w:history="1">
         <w:r>
           <w:rPr>
             <w:rStyle w:val="Hyperlink"/>
@@ -1740,7 +1740,7 @@
             <w:noProof/>
             <w:webHidden/>
           </w:rPr>
-          <w:instrText xml:space="preserve"> PAGEREF _Toc243590864 \h </w:instrText>
+          <w:instrText xml:space="preserve"> PAGEREF _Toc243688701 \h </w:instrText>
         </w:r>
         <w:r>
           <w:rPr>
@@ -1786,7 +1786,7 @@
           <w14:ligatures w14:val="standardContextual"/>
         </w:rPr>
       </w:pPr>
-      <w:hyperlink w:anchor="_Toc243590865" w:history="1">
+      <w:hyperlink w:anchor="_Toc243688702" w:history="1">
         <w:r>
           <w:rPr>
             <w:rStyle w:val="Hyperlink"/>
@@ -1813,7 +1813,7 @@
             <w:noProof/>
             <w:webHidden/>
           </w:rPr>
-          <w:instrText xml:space="preserve"> PAGEREF _Toc243590865 \h </w:instrText>
+          <w:instrText xml:space="preserve"> PAGEREF _Toc243688702 \h </w:instrText>
         </w:r>
         <w:r>
           <w:rPr>
@@ -1859,7 +1859,7 @@
           <w14:ligatures w14:val="standardContextual"/>
         </w:rPr>
       </w:pPr>
-      <w:hyperlink w:anchor="_Toc243590866" w:history="1">
+      <w:hyperlink w:anchor="_Toc243688703" w:history="1">
         <w:r>
           <w:rPr>
             <w:rStyle w:val="Hyperlink"/>
@@ -1886,7 +1886,7 @@
             <w:noProof/>
             <w:webHidden/>
           </w:rPr>
-          <w:instrText xml:space="preserve"> PAGEREF _Toc243590866 \h </w:instrText>
+          <w:instrText xml:space="preserve"> PAGEREF _Toc243688703 \h </w:instrText>
         </w:r>
         <w:r>
           <w:rPr>
@@ -1932,7 +1932,7 @@
           <w14:ligatures w14:val="standardContextual"/>
         </w:rPr>
       </w:pPr>
-      <w:hyperlink w:anchor="_Toc243590867" w:history="1">
+      <w:hyperlink w:anchor="_Toc243688704" w:history="1">
         <w:r>
           <w:rPr>
             <w:rStyle w:val="Hyperlink"/>
@@ -1959,7 +1959,7 @@
             <w:noProof/>
             <w:webHidden/>
           </w:rPr>
-          <w:instrText xml:space="preserve"> PAGEREF _Toc243590867 \h </w:instrText>
+          <w:instrText xml:space="preserve"> PAGEREF _Toc243688704 \h </w:instrText>
         </w:r>
         <w:r>
           <w:rPr>
@@ -2005,7 +2005,7 @@
           <w14:ligatures w14:val="standardContextual"/>
         </w:rPr>
       </w:pPr>
-      <w:hyperlink w:anchor="_Toc243590868" w:history="1">
+      <w:hyperlink w:anchor="_Toc243688705" w:history="1">
         <w:r>
           <w:rPr>
             <w:rStyle w:val="Hyperlink"/>
@@ -2032,7 +2032,7 @@
             <w:noProof/>
             <w:webHidden/>
           </w:rPr>
-          <w:instrText xml:space="preserve"> PAGEREF _Toc243590868 \h </w:instrText>
+          <w:instrText xml:space="preserve"> PAGEREF _Toc243688705 \h </w:instrText>
         </w:r>
         <w:r>
           <w:rPr>
@@ -2078,7 +2078,7 @@
           <w14:ligatures w14:val="standardContextual"/>
         </w:rPr>
       </w:pPr>
-      <w:hyperlink w:anchor="_Toc243590869" w:history="1">
+      <w:hyperlink w:anchor="_Toc243688706" w:history="1">
         <w:r>
           <w:rPr>
             <w:rStyle w:val="Hyperlink"/>
@@ -2105,7 +2105,7 @@
             <w:noProof/>
             <w:webHidden/>
           </w:rPr>
-          <w:instrText xml:space="preserve"> PAGEREF _Toc243590869 \h </w:instrText>
+          <w:instrText xml:space="preserve"> PAGEREF _Toc243688706 \h </w:instrText>
         </w:r>
         <w:r>
           <w:rPr>
@@ -2151,7 +2151,7 @@
           <w14:ligatures w14:val="standardContextual"/>
         </w:rPr>
       </w:pPr>
-      <w:hyperlink w:anchor="_Toc243590870" w:history="1">
+      <w:hyperlink w:anchor="_Toc243688707" w:history="1">
         <w:r>
           <w:rPr>
             <w:rStyle w:val="Hyperlink"/>
@@ -2178,7 +2178,7 @@
             <w:noProof/>
             <w:webHidden/>
           </w:rPr>
-          <w:instrText xml:space="preserve"> PAGEREF _Toc243590870 \h </w:instrText>
+          <w:instrText xml:space="preserve"> PAGEREF _Toc243688707 \h </w:instrText>
         </w:r>
         <w:r>
           <w:rPr>
@@ -2224,7 +2224,7 @@
           <w14:ligatures w14:val="standardContextual"/>
         </w:rPr>
       </w:pPr>
-      <w:hyperlink w:anchor="_Toc243590871" w:history="1">
+      <w:hyperlink w:anchor="_Toc243688708" w:history="1">
         <w:r>
           <w:rPr>
             <w:rStyle w:val="Hyperlink"/>
@@ -2251,7 +2251,7 @@
             <w:noProof/>
             <w:webHidden/>
           </w:rPr>
-          <w:instrText xml:space="preserve"> PAGEREF _Toc243590871 \h </w:instrText>
+          <w:instrText xml:space="preserve"> PAGEREF _Toc243688708 \h </w:instrText>
         </w:r>
         <w:r>
           <w:rPr>
@@ -2297,7 +2297,7 @@
           <w14:ligatures w14:val="standardContextual"/>
         </w:rPr>
       </w:pPr>
-      <w:hyperlink w:anchor="_Toc243590872" w:history="1">
+      <w:hyperlink w:anchor="_Toc243688709" w:history="1">
         <w:r>
           <w:rPr>
             <w:rStyle w:val="Hyperlink"/>
@@ -2324,7 +2324,7 @@
             <w:noProof/>
             <w:webHidden/>
           </w:rPr>
-          <w:instrText xml:space="preserve"> PAGEREF _Toc243590872 \h </w:instrText>
+          <w:instrText xml:space="preserve"> PAGEREF _Toc243688709 \h </w:instrText>
         </w:r>
         <w:r>
           <w:rPr>
@@ -2370,7 +2370,7 @@
           <w14:ligatures w14:val="standardContextual"/>
         </w:rPr>
       </w:pPr>
-      <w:hyperlink w:anchor="_Toc243590873" w:history="1">
+      <w:hyperlink w:anchor="_Toc243688710" w:history="1">
         <w:r>
           <w:rPr>
             <w:rStyle w:val="Hyperlink"/>
@@ -2397,7 +2397,7 @@
             <w:noProof/>
             <w:webHidden/>
           </w:rPr>
-          <w:instrText xml:space="preserve"> PAGEREF _Toc243590873 \h </w:instrText>
+          <w:instrText xml:space="preserve"> PAGEREF _Toc243688710 \h </w:instrText>
         </w:r>
         <w:r>
           <w:rPr>
@@ -2443,7 +2443,7 @@
           <w14:ligatures w14:val="standardContextual"/>
         </w:rPr>
       </w:pPr>
-      <w:hyperlink w:anchor="_Toc243590874" w:history="1">
+      <w:hyperlink w:anchor="_Toc243688711" w:history="1">
         <w:r>
           <w:rPr>
             <w:rStyle w:val="Hyperlink"/>
@@ -2470,7 +2470,7 @@
             <w:noProof/>
             <w:webHidden/>
           </w:rPr>
-          <w:instrText xml:space="preserve"> PAGEREF _Toc243590874 \h </w:instrText>
+          <w:instrText xml:space="preserve"> PAGEREF _Toc243688711 \h </w:instrText>
         </w:r>
         <w:r>
           <w:rPr>
@@ -2516,7 +2516,7 @@
           <w14:ligatures w14:val="standardContextual"/>
         </w:rPr>
       </w:pPr>
-      <w:hyperlink w:anchor="_Toc243590875" w:history="1">
+      <w:hyperlink w:anchor="_Toc243688712" w:history="1">
         <w:r>
           <w:rPr>
             <w:rStyle w:val="Hyperlink"/>
@@ -2543,7 +2543,7 @@
             <w:noProof/>
             <w:webHidden/>
           </w:rPr>
-          <w:instrText xml:space="preserve"> PAGEREF _Toc243590875 \h </w:instrText>
+          <w:instrText xml:space="preserve"> PAGEREF _Toc243688712 \h </w:instrText>
         </w:r>
         <w:r>
           <w:rPr>
@@ -2589,7 +2589,7 @@
           <w14:ligatures w14:val="standardContextual"/>
         </w:rPr>
       </w:pPr>
-      <w:hyperlink w:anchor="_Toc243590876" w:history="1">
+      <w:hyperlink w:anchor="_Toc243688713" w:history="1">
         <w:r>
           <w:rPr>
             <w:rStyle w:val="Hyperlink"/>
@@ -2616,7 +2616,7 @@
             <w:noProof/>
             <w:webHidden/>
           </w:rPr>
-          <w:instrText xml:space="preserve"> PAGEREF _Toc243590876 \h </w:instrText>
+          <w:instrText xml:space="preserve"> PAGEREF _Toc243688713 \h </w:instrText>
         </w:r>
         <w:r>
           <w:rPr>
@@ -2662,7 +2662,7 @@
           <w14:ligatures w14:val="standardContextual"/>
         </w:rPr>
       </w:pPr>
-      <w:hyperlink w:anchor="_Toc243590877" w:history="1">
+      <w:hyperlink w:anchor="_Toc243688714" w:history="1">
         <w:r>
           <w:rPr>
             <w:rStyle w:val="Hyperlink"/>
@@ -2689,7 +2689,7 @@
             <w:noProof/>
             <w:webHidden/>
           </w:rPr>
-          <w:instrText xml:space="preserve"> PAGEREF _Toc243590877 \h </w:instrText>
+          <w:instrText xml:space="preserve"> PAGEREF _Toc243688714 \h </w:instrText>
         </w:r>
         <w:r>
           <w:rPr>
@@ -2735,7 +2735,7 @@
           <w14:ligatures w14:val="standardContextual"/>
         </w:rPr>
       </w:pPr>
-      <w:hyperlink w:anchor="_Toc243590878" w:history="1">
+      <w:hyperlink w:anchor="_Toc243688715" w:history="1">
         <w:r>
           <w:rPr>
             <w:rStyle w:val="Hyperlink"/>
@@ -2762,7 +2762,7 @@
             <w:noProof/>
             <w:webHidden/>
           </w:rPr>
-          <w:instrText xml:space="preserve"> PAGEREF _Toc243590878 \h </w:instrText>
+          <w:instrText xml:space="preserve"> PAGEREF _Toc243688715 \h </w:instrText>
         </w:r>
         <w:r>
           <w:rPr>
@@ -2808,7 +2808,7 @@
           <w14:ligatures w14:val="standardContextual"/>
         </w:rPr>
       </w:pPr>
-      <w:hyperlink w:anchor="_Toc243590879" w:history="1">
+      <w:hyperlink w:anchor="_Toc243688716" w:history="1">
         <w:r>
           <w:rPr>
             <w:rStyle w:val="Hyperlink"/>
@@ -2835,7 +2835,7 @@
             <w:noProof/>
             <w:webHidden/>
           </w:rPr>
-          <w:instrText xml:space="preserve"> PAGEREF _Toc243590879 \h </w:instrText>
+          <w:instrText xml:space="preserve"> PAGEREF _Toc243688716 \h </w:instrText>
         </w:r>
         <w:r>
           <w:rPr>
@@ -2881,7 +2881,7 @@
           <w14:ligatures w14:val="standardContextual"/>
         </w:rPr>
       </w:pPr>
-      <w:hyperlink w:anchor="_Toc243590880" w:history="1">
+      <w:hyperlink w:anchor="_Toc243688717" w:history="1">
         <w:r>
           <w:rPr>
             <w:rStyle w:val="Hyperlink"/>
@@ -2908,7 +2908,7 @@
             <w:noProof/>
             <w:webHidden/>
           </w:rPr>
-          <w:instrText xml:space="preserve"> PAGEREF _Toc243590880 \h </w:instrText>
+          <w:instrText xml:space="preserve"> PAGEREF _Toc243688717 \h </w:instrText>
         </w:r>
         <w:r>
           <w:rPr>
@@ -2954,7 +2954,7 @@
           <w14:ligatures w14:val="standardContextual"/>
         </w:rPr>
       </w:pPr>
-      <w:hyperlink w:anchor="_Toc243590881" w:history="1">
+      <w:hyperlink w:anchor="_Toc243688718" w:history="1">
         <w:r>
           <w:rPr>
             <w:rStyle w:val="Hyperlink"/>
@@ -2981,7 +2981,7 @@
             <w:noProof/>
             <w:webHidden/>
           </w:rPr>
-          <w:instrText xml:space="preserve"> PAGEREF _Toc243590881 \h </w:instrText>
+          <w:instrText xml:space="preserve"> PAGEREF _Toc243688718 \h </w:instrText>
         </w:r>
         <w:r>
           <w:rPr>
@@ -3027,7 +3027,7 @@
           <w14:ligatures w14:val="standardContextual"/>
         </w:rPr>
       </w:pPr>
-      <w:hyperlink w:anchor="_Toc243590882" w:history="1">
+      <w:hyperlink w:anchor="_Toc243688719" w:history="1">
         <w:r>
           <w:rPr>
             <w:rStyle w:val="Hyperlink"/>
@@ -3054,7 +3054,7 @@
             <w:noProof/>
             <w:webHidden/>
           </w:rPr>
-          <w:instrText xml:space="preserve"> PAGEREF _Toc243590882 \h </w:instrText>
+          <w:instrText xml:space="preserve"> PAGEREF _Toc243688719 \h </w:instrText>
         </w:r>
         <w:r>
           <w:rPr>
@@ -3100,7 +3100,7 @@
           <w14:ligatures w14:val="standardContextual"/>
         </w:rPr>
       </w:pPr>
-      <w:hyperlink w:anchor="_Toc243590883" w:history="1">
+      <w:hyperlink w:anchor="_Toc243688720" w:history="1">
         <w:r>
           <w:rPr>
             <w:rStyle w:val="Hyperlink"/>
@@ -3127,7 +3127,7 @@
             <w:noProof/>
             <w:webHidden/>
           </w:rPr>
-          <w:instrText xml:space="preserve"> PAGEREF _Toc243590883 \h </w:instrText>
+          <w:instrText xml:space="preserve"> PAGEREF _Toc243688720 \h </w:instrText>
         </w:r>
         <w:r>
           <w:rPr>
@@ -3147,7 +3147,7 @@
             <w:noProof/>
             <w:webHidden/>
           </w:rPr>
-          <w:t>25</w:t>
+          <w:t>26</w:t>
         </w:r>
         <w:r>
           <w:rPr>
@@ -3173,7 +3173,7 @@
           <w14:ligatures w14:val="standardContextual"/>
         </w:rPr>
       </w:pPr>
-      <w:hyperlink w:anchor="_Toc243590884" w:history="1">
+      <w:hyperlink w:anchor="_Toc243688721" w:history="1">
         <w:r>
           <w:rPr>
             <w:rStyle w:val="Hyperlink"/>
@@ -3200,7 +3200,7 @@
             <w:noProof/>
             <w:webHidden/>
           </w:rPr>
-          <w:instrText xml:space="preserve"> PAGEREF _Toc243590884 \h </w:instrText>
+          <w:instrText xml:space="preserve"> PAGEREF _Toc243688721 \h </w:instrText>
         </w:r>
         <w:r>
           <w:rPr>
@@ -3246,7 +3246,7 @@
           <w14:ligatures w14:val="standardContextual"/>
         </w:rPr>
       </w:pPr>
-      <w:hyperlink w:anchor="_Toc243590885" w:history="1">
+      <w:hyperlink w:anchor="_Toc243688722" w:history="1">
         <w:r>
           <w:rPr>
             <w:rStyle w:val="Hyperlink"/>
@@ -3273,7 +3273,7 @@
             <w:noProof/>
             <w:webHidden/>
           </w:rPr>
-          <w:instrText xml:space="preserve"> PAGEREF _Toc243590885 \h </w:instrText>
+          <w:instrText xml:space="preserve"> PAGEREF _Toc243688722 \h </w:instrText>
         </w:r>
         <w:r>
           <w:rPr>
@@ -3318,7 +3318,7 @@
       <w:pPr>
         <w:pStyle w:val="Heading1"/>
       </w:pPr>
-      <w:bookmarkStart w:id="0" w:name="_Toc243590842"/>
+      <w:bookmarkStart w:id="0" w:name="_Toc243688679"/>
       <w:r>
         <w:lastRenderedPageBreak/>
         <w:t>1. Introducción y alcance</w:t>
@@ -3658,7 +3658,7 @@
       <w:pPr>
         <w:pStyle w:val="Heading1"/>
       </w:pPr>
-      <w:bookmarkStart w:id="1" w:name="_Toc243590843"/>
+      <w:bookmarkStart w:id="1" w:name="_Toc243688680"/>
       <w:r>
         <w:t>2. Arquitectura del sistema</w:t>
       </w:r>
@@ -3668,7 +3668,7 @@
       <w:pPr>
         <w:pStyle w:val="Heading2"/>
       </w:pPr>
-      <w:bookmarkStart w:id="2" w:name="_Toc243590844"/>
+      <w:bookmarkStart w:id="2" w:name="_Toc243688681"/>
       <w:r>
         <w:t>2.1 Visión general</w:t>
       </w:r>
@@ -3805,7 +3805,7 @@
       <w:pPr>
         <w:pStyle w:val="Heading2"/>
       </w:pPr>
-      <w:bookmarkStart w:id="3" w:name="_Toc243590845"/>
+      <w:bookmarkStart w:id="3" w:name="_Toc243688682"/>
       <w:r>
         <w:t>2.2 Recorrido de una petición</w:t>
       </w:r>
@@ -3974,7 +3974,7 @@
       <w:pPr>
         <w:pStyle w:val="Heading2"/>
       </w:pPr>
-      <w:bookmarkStart w:id="4" w:name="_Toc243590846"/>
+      <w:bookmarkStart w:id="4" w:name="_Toc243688683"/>
       <w:r>
         <w:t>2.3 Tecnologías y versiones</w:t>
       </w:r>
@@ -5087,7 +5087,7 @@
       <w:pPr>
         <w:pStyle w:val="Heading2"/>
       </w:pPr>
-      <w:bookmarkStart w:id="5" w:name="_Toc243590847"/>
+      <w:bookmarkStart w:id="5" w:name="_Toc243688684"/>
       <w:r>
         <w:t>2.4 Estructura del código</w:t>
       </w:r>
@@ -6036,7 +6036,7 @@
       <w:pPr>
         <w:pStyle w:val="Heading2"/>
       </w:pPr>
-      <w:bookmarkStart w:id="6" w:name="_Toc243590848"/>
+      <w:bookmarkStart w:id="6" w:name="_Toc243688685"/>
       <w:r>
         <w:t>2.5 Seguridad y control de acceso</w:t>
       </w:r>
@@ -6507,7 +6507,7 @@
       <w:pPr>
         <w:pStyle w:val="Heading2"/>
       </w:pPr>
-      <w:bookmarkStart w:id="7" w:name="_Toc243590849"/>
+      <w:bookmarkStart w:id="7" w:name="_Toc243688686"/>
       <w:r>
         <w:t>2.6 Documentación de la API</w:t>
       </w:r>
@@ -6703,7 +6703,7 @@
       <w:pPr>
         <w:pStyle w:val="Heading1"/>
       </w:pPr>
-      <w:bookmarkStart w:id="8" w:name="_Toc243590850"/>
+      <w:bookmarkStart w:id="8" w:name="_Toc243688687"/>
       <w:r>
         <w:t>3. Requisitos y topología de despliegue</w:t>
       </w:r>
@@ -6713,7 +6713,7 @@
       <w:pPr>
         <w:pStyle w:val="Heading2"/>
       </w:pPr>
-      <w:bookmarkStart w:id="9" w:name="_Toc243590851"/>
+      <w:bookmarkStart w:id="9" w:name="_Toc243688688"/>
       <w:r>
         <w:t>3.1 Topología de despliegue</w:t>
       </w:r>
@@ -7492,7 +7492,7 @@
       <w:pPr>
         <w:pStyle w:val="Heading2"/>
       </w:pPr>
-      <w:bookmarkStart w:id="10" w:name="_Toc243590852"/>
+      <w:bookmarkStart w:id="10" w:name="_Toc243688689"/>
       <w:r>
         <w:t>3.2 Hardware y software de los servidores</w:t>
       </w:r>
@@ -8017,7 +8017,7 @@
       <w:pPr>
         <w:pStyle w:val="Heading2"/>
       </w:pPr>
-      <w:bookmarkStart w:id="11" w:name="_Toc243590853"/>
+      <w:bookmarkStart w:id="11" w:name="_Toc243688690"/>
       <w:r>
         <w:t>3.3 Requisitos de los equipos cliente</w:t>
       </w:r>
@@ -8051,7 +8051,7 @@
       <w:pPr>
         <w:pStyle w:val="Heading2"/>
       </w:pPr>
-      <w:bookmarkStart w:id="12" w:name="_Toc243590854"/>
+      <w:bookmarkStart w:id="12" w:name="_Toc243688691"/>
       <w:r>
         <w:t>3.4 Accesos y datos necesarios antes de instalar</w:t>
       </w:r>
@@ -8103,14 +8103,14 @@
       </w:pPr>
       <w:r>
         <w:lastRenderedPageBreak/>
-        <w:t>Catálogos base de la empresa: clientes, proveedores, vehículos, productos por tipo, tipos de etapa (Pelado, Corte, Fritura y Embalaje), tipos de merma, cuartos fríos y el umbral de Grados Brix vigente.</w:t>
+        <w:t>Catálogos base de la empresa: clientes, proveedores, vehículos (con la capacidad del tanque de cada uno, en galones), productos por tipo, tipos de etapa (Pelado, Corte, Fritura y Embalaje), tipos de merma, cuartos fríos y el umbral de Grados Brix vigente.</w:t>
       </w:r>
     </w:p>
     <w:p>
       <w:pPr>
         <w:pStyle w:val="Heading1"/>
       </w:pPr>
-      <w:bookmarkStart w:id="13" w:name="_Toc243590855"/>
+      <w:bookmarkStart w:id="13" w:name="_Toc243688692"/>
       <w:r>
         <w:t>4. Variables de entorno</w:t>
       </w:r>
@@ -8120,7 +8120,7 @@
       <w:pPr>
         <w:pStyle w:val="Heading2"/>
       </w:pPr>
-      <w:bookmarkStart w:id="14" w:name="_Toc243590856"/>
+      <w:bookmarkStart w:id="14" w:name="_Toc243688693"/>
       <w:r>
         <w:t>4.1 Backend (archivo Backend/.env)</w:t>
       </w:r>
@@ -8148,9 +8148,9 @@
         <w:tblLook w:val="04A0" w:firstRow="1" w:lastRow="0" w:firstColumn="1" w:lastColumn="0" w:noHBand="0" w:noVBand="1"/>
       </w:tblPr>
       <w:tblGrid>
-        <w:gridCol w:w="2846"/>
-        <w:gridCol w:w="4120"/>
-        <w:gridCol w:w="1863"/>
+        <w:gridCol w:w="2562"/>
+        <w:gridCol w:w="4609"/>
+        <w:gridCol w:w="1685"/>
       </w:tblGrid>
       <w:tr>
         <w:trPr>
@@ -8926,7 +8926,7 @@
               <w:rPr>
                 <w:sz w:val="19"/>
               </w:rPr>
-              <w:t>Secreto de firma de los tokens. Generar uno largo y aleatorio y mantenerlo privado.</w:t>
+              <w:t>Secreto de firma de los tokens. Obligatorio: al menos 32 caracteres y distinto de los valores de ejemplo; si falta o es débil, la API no arranca. Generarlo con node -e "console.log(require('crypto').randomBytes(48).toString('hex'))" y mantenerlo privado.</w:t>
             </w:r>
           </w:p>
         </w:tc>
@@ -8944,7 +8944,7 @@
               <w:rPr>
                 <w:sz w:val="19"/>
               </w:rPr>
-              <w:t>dev-secret-change-me (inseguro)</w:t>
+              <w:t>(ninguno: obligatorio)</w:t>
             </w:r>
           </w:p>
         </w:tc>
@@ -9097,7 +9097,7 @@
       <w:pPr>
         <w:pStyle w:val="Heading2"/>
       </w:pPr>
-      <w:bookmarkStart w:id="15" w:name="_Toc243590857"/>
+      <w:bookmarkStart w:id="15" w:name="_Toc243688694"/>
       <w:r>
         <w:lastRenderedPageBreak/>
         <w:t>4.2 Frontend (archivo Frontend/.env.production)</w:t>
@@ -9263,7 +9263,7 @@
       <w:pPr>
         <w:pStyle w:val="Heading1"/>
       </w:pPr>
-      <w:bookmarkStart w:id="16" w:name="_Toc243590858"/>
+      <w:bookmarkStart w:id="16" w:name="_Toc243688695"/>
       <w:r>
         <w:t>5. Instalación en producción</w:t>
       </w:r>
@@ -9540,7 +9540,7 @@
       <w:pPr>
         <w:pStyle w:val="Heading2"/>
       </w:pPr>
-      <w:bookmarkStart w:id="17" w:name="_Toc243590859"/>
+      <w:bookmarkStart w:id="17" w:name="_Toc243688696"/>
       <w:r>
         <w:t>5.1 Día 1 – Preparación de los servidores</w:t>
       </w:r>
@@ -9629,13 +9629,6 @@
           <w:sz w:val="19"/>
         </w:rPr>
         <w:br/>
-      </w:r>
-      <w:r>
-        <w:rPr>
-          <w:rFonts w:ascii="Consolas" w:hAnsi="Consolas"/>
-          <w:color w:val="1F1F1F"/>
-          <w:sz w:val="19"/>
-        </w:rPr>
         <w:t>sudo systemctl enable mysql --now</w:t>
       </w:r>
       <w:r>
@@ -9701,13 +9694,6 @@
           <w:sz w:val="19"/>
         </w:rPr>
         <w:br/>
-      </w:r>
-      <w:r>
-        <w:rPr>
-          <w:rFonts w:ascii="Consolas" w:hAnsi="Consolas"/>
-          <w:color w:val="1F1F1F"/>
-          <w:sz w:val="19"/>
-        </w:rPr>
         <w:t>CREATE USER 'app_yaneth'@'localhost' IDENTIFIED BY '&lt;contraseña-segura&gt;';</w:t>
       </w:r>
       <w:r>
@@ -9870,13 +9856,6 @@
           <w:sz w:val="19"/>
         </w:rPr>
         <w:br/>
-      </w:r>
-      <w:r>
-        <w:rPr>
-          <w:rFonts w:ascii="Consolas" w:hAnsi="Consolas"/>
-          <w:color w:val="1F1F1F"/>
-          <w:sz w:val="19"/>
-        </w:rPr>
         <w:t>#   requirepass &lt;contraseña-redis&gt;   (obligatorio en B, recomendado en A)</w:t>
       </w:r>
       <w:r>
@@ -10312,7 +10291,7 @@
       <w:pPr>
         <w:pStyle w:val="Heading2"/>
       </w:pPr>
-      <w:bookmarkStart w:id="18" w:name="_Toc243590860"/>
+      <w:bookmarkStart w:id="18" w:name="_Toc243688697"/>
       <w:r>
         <w:t>5.2 Día 2 – Migración y configuración</w:t>
       </w:r>
@@ -10484,13 +10463,6 @@
           <w:sz w:val="19"/>
         </w:rPr>
         <w:br/>
-      </w:r>
-      <w:r>
-        <w:rPr>
-          <w:rFonts w:ascii="Consolas" w:hAnsi="Consolas"/>
-          <w:color w:val="1F1F1F"/>
-          <w:sz w:val="19"/>
-        </w:rPr>
         <w:t>VALUES ('Administrador del sistema', 'admin', '&lt;hash-generado&gt;', 'Administrador');</w:t>
       </w:r>
     </w:p>
@@ -10619,13 +10591,6 @@
           <w:sz w:val="19"/>
         </w:rPr>
         <w:br/>
-      </w:r>
-      <w:r>
-        <w:rPr>
-          <w:rFonts w:ascii="Consolas" w:hAnsi="Consolas"/>
-          <w:color w:val="1F1F1F"/>
-          <w:sz w:val="19"/>
-        </w:rPr>
         <w:t>REDIS_PORT=6379</w:t>
       </w:r>
       <w:r>
@@ -10766,13 +10731,6 @@
           <w:sz w:val="19"/>
         </w:rPr>
         <w:br/>
-      </w:r>
-      <w:r>
-        <w:rPr>
-          <w:rFonts w:ascii="Consolas" w:hAnsi="Consolas"/>
-          <w:color w:val="1F1F1F"/>
-          <w:sz w:val="19"/>
-        </w:rPr>
         <w:t>pm2 startup systemd              # ejecutar el comando sudo que imprime</w:t>
       </w:r>
     </w:p>
@@ -10981,13 +10939,6 @@
           <w:sz w:val="19"/>
         </w:rPr>
         <w:br/>
-      </w:r>
-      <w:r>
-        <w:rPr>
-          <w:rFonts w:ascii="Consolas" w:hAnsi="Consolas"/>
-          <w:color w:val="1F1F1F"/>
-          <w:sz w:val="19"/>
-        </w:rPr>
         <w:t xml:space="preserve">        proxy_set_header Host $host;</w:t>
       </w:r>
       <w:r>
@@ -11121,13 +11072,6 @@
           <w:sz w:val="19"/>
         </w:rPr>
         <w:br/>
-      </w:r>
-      <w:r>
-        <w:rPr>
-          <w:rFonts w:ascii="Consolas" w:hAnsi="Consolas"/>
-          <w:color w:val="1F1F1F"/>
-          <w:sz w:val="19"/>
-        </w:rPr>
         <w:t xml:space="preserve">        add_header Cache-Control "public, immutable";</w:t>
       </w:r>
       <w:r>
@@ -11283,13 +11227,6 @@
           <w:sz w:val="19"/>
         </w:rPr>
         <w:br/>
-      </w:r>
-      <w:r>
-        <w:rPr>
-          <w:rFonts w:ascii="Consolas" w:hAnsi="Consolas"/>
-          <w:color w:val="1F1F1F"/>
-          <w:sz w:val="19"/>
-        </w:rPr>
         <w:t>sudo certbot --nginx -d &lt;dominio-del-sistema&gt; --redirect</w:t>
       </w:r>
       <w:r>
@@ -11378,7 +11315,7 @@
       <w:pPr>
         <w:pStyle w:val="Heading2"/>
       </w:pPr>
-      <w:bookmarkStart w:id="19" w:name="_Toc243590861"/>
+      <w:bookmarkStart w:id="19" w:name="_Toc243688698"/>
       <w:r>
         <w:t>5.3 Día 3 – Configuración inicial de datos y pruebas</w:t>
       </w:r>
@@ -12148,7 +12085,7 @@
       <w:pPr>
         <w:pStyle w:val="Heading1"/>
       </w:pPr>
-      <w:bookmarkStart w:id="20" w:name="_Toc243590862"/>
+      <w:bookmarkStart w:id="20" w:name="_Toc243688699"/>
       <w:r>
         <w:t>6. Operación de los servicios</w:t>
       </w:r>
@@ -12158,7 +12095,7 @@
       <w:pPr>
         <w:pStyle w:val="Heading2"/>
       </w:pPr>
-      <w:bookmarkStart w:id="21" w:name="_Toc243590863"/>
+      <w:bookmarkStart w:id="21" w:name="_Toc243688700"/>
       <w:r>
         <w:t>6.1 Orden de arranque</w:t>
       </w:r>
@@ -12230,7 +12167,7 @@
       <w:pPr>
         <w:pStyle w:val="Heading2"/>
       </w:pPr>
-      <w:bookmarkStart w:id="22" w:name="_Toc243590864"/>
+      <w:bookmarkStart w:id="22" w:name="_Toc243688701"/>
       <w:r>
         <w:t>6.2 Comandos de operación</w:t>
       </w:r>
@@ -12739,7 +12676,7 @@
       <w:pPr>
         <w:pStyle w:val="Heading2"/>
       </w:pPr>
-      <w:bookmarkStart w:id="23" w:name="_Toc243590865"/>
+      <w:bookmarkStart w:id="23" w:name="_Toc243688702"/>
       <w:r>
         <w:t>6.3 Registros (logs)</w:t>
       </w:r>
@@ -13153,7 +13090,7 @@
       <w:pPr>
         <w:pStyle w:val="Heading1"/>
       </w:pPr>
-      <w:bookmarkStart w:id="24" w:name="_Toc243590866"/>
+      <w:bookmarkStart w:id="24" w:name="_Toc243688703"/>
       <w:r>
         <w:t>7. Respaldos y restauración</w:t>
       </w:r>
@@ -13163,7 +13100,7 @@
       <w:pPr>
         <w:pStyle w:val="Heading2"/>
       </w:pPr>
-      <w:bookmarkStart w:id="25" w:name="_Toc243590867"/>
+      <w:bookmarkStart w:id="25" w:name="_Toc243688704"/>
       <w:r>
         <w:t>7.1 Qué se respalda</w:t>
       </w:r>
@@ -13205,7 +13142,7 @@
       <w:pPr>
         <w:pStyle w:val="Heading2"/>
       </w:pPr>
-      <w:bookmarkStart w:id="26" w:name="_Toc243590868"/>
+      <w:bookmarkStart w:id="26" w:name="_Toc243688705"/>
       <w:r>
         <w:t>7.2 Respaldo diario automático</w:t>
       </w:r>
@@ -13273,13 +13210,6 @@
         </w:rPr>
         <w:lastRenderedPageBreak/>
         <w:br/>
-      </w:r>
-      <w:r>
-        <w:rPr>
-          <w:rFonts w:ascii="Consolas" w:hAnsi="Consolas"/>
-          <w:color w:val="1F1F1F"/>
-          <w:sz w:val="19"/>
-        </w:rPr>
         <w:t>sudo mkdir -p /respaldos &amp;&amp; sudo chown $USER /respaldos</w:t>
       </w:r>
       <w:r>
@@ -13345,7 +13275,7 @@
       <w:pPr>
         <w:pStyle w:val="Heading2"/>
       </w:pPr>
-      <w:bookmarkStart w:id="27" w:name="_Toc243590869"/>
+      <w:bookmarkStart w:id="27" w:name="_Toc243688706"/>
       <w:r>
         <w:t>7.3 Restauración</w:t>
       </w:r>
@@ -13387,8 +13317,6 @@
       </w:r>
       <w:r>
         <w:tab/>
-      </w:r>
-      <w:r>
         <w:t>Restaurar el archivo elegido en el servidor de base de datos:</w:t>
       </w:r>
     </w:p>
@@ -13424,7 +13352,7 @@
       <w:pPr>
         <w:pStyle w:val="Heading2"/>
       </w:pPr>
-      <w:bookmarkStart w:id="28" w:name="_Toc243590870"/>
+      <w:bookmarkStart w:id="28" w:name="_Toc243688707"/>
       <w:r>
         <w:t>7.4 Prueba periódica de restauración</w:t>
       </w:r>
@@ -13439,7 +13367,7 @@
       <w:pPr>
         <w:pStyle w:val="Heading1"/>
       </w:pPr>
-      <w:bookmarkStart w:id="29" w:name="_Toc243590871"/>
+      <w:bookmarkStart w:id="29" w:name="_Toc243688708"/>
       <w:r>
         <w:t>8. Mantenimiento</w:t>
       </w:r>
@@ -13449,7 +13377,7 @@
       <w:pPr>
         <w:pStyle w:val="Heading2"/>
       </w:pPr>
-      <w:bookmarkStart w:id="30" w:name="_Toc243590872"/>
+      <w:bookmarkStart w:id="30" w:name="_Toc243688709"/>
       <w:r>
         <w:t>8.1 Rutinas de mantenimiento</w:t>
       </w:r>
@@ -13700,7 +13628,7 @@
       <w:pPr>
         <w:pStyle w:val="Heading2"/>
       </w:pPr>
-      <w:bookmarkStart w:id="31" w:name="_Toc243590873"/>
+      <w:bookmarkStart w:id="31" w:name="_Toc243688710"/>
       <w:r>
         <w:t>8.2 Actualizar a una nueva versión del sistema</w:t>
       </w:r>
@@ -13768,8 +13696,6 @@
       </w:r>
       <w:r>
         <w:tab/>
-      </w:r>
-      <w:r>
         <w:t>Actualizar dependencias y reiniciar la API.</w:t>
       </w:r>
     </w:p>
@@ -13827,7 +13753,7 @@
       <w:pPr>
         <w:pStyle w:val="Heading2"/>
       </w:pPr>
-      <w:bookmarkStart w:id="32" w:name="_Toc243590874"/>
+      <w:bookmarkStart w:id="32" w:name="_Toc243688711"/>
       <w:r>
         <w:t>8.3 Migraciones de la base de datos</w:t>
       </w:r>
@@ -13835,7 +13761,7 @@
     </w:p>
     <w:p>
       <w:r>
-        <w:t>Cada cambio de estructura se guarda en sql/migrations/ con el formato AAAA-MM-DD_descripcion.sql. schema.sql ya contiene todos los cambios hasta su fecha de generación (9 de octubre de 2026); por ello, en una instalación nueva no se ejecutan migraciones. En una base existente se aplican, en orden, solo las migraciones posteriores a la última aplicada, desde el servidor de aplicación:</w:t>
+        <w:t>Cada cambio de estructura se guarda en sql/migrations/ con el formato AAAA-MM-DD_descripcion.sql. schema.sql ya contiene todos los cambios hasta su fecha de generación (23 de octubre de 2026, con el control de combustible); por ello, en una instalación nueva no se ejecutan migraciones. En una base existente se aplican, en orden, solo las migraciones posteriores a la última aplicada, desde el servidor de aplicación:</w:t>
       </w:r>
     </w:p>
     <w:p>
@@ -13850,7 +13776,7 @@
           <w:color w:val="1F1F1F"/>
           <w:sz w:val="19"/>
         </w:rPr>
-        <w:t>mysql -h &lt;IP-DB&gt; -u app_yaneth -p proyecto_graduacion &lt; sql/migrations/2026-10-09_add_codigo_trazabilidad.sql</w:t>
+        <w:t>mysql -h &lt;IP-DB&gt; -u app_yaneth -p proyecto_graduacion &lt; sql/migrations/2026-10-23_add_control_combustible.sql</w:t>
       </w:r>
     </w:p>
     <w:p>
@@ -13862,7 +13788,7 @@
       <w:pPr>
         <w:pStyle w:val="Heading2"/>
       </w:pPr>
-      <w:bookmarkStart w:id="33" w:name="_Toc243590875"/>
+      <w:bookmarkStart w:id="33" w:name="_Toc243688712"/>
       <w:r>
         <w:t>8.4 Gestión de usuarios y accesos</w:t>
       </w:r>
@@ -13912,7 +13838,7 @@
       <w:pPr>
         <w:pStyle w:val="Heading2"/>
       </w:pPr>
-      <w:bookmarkStart w:id="34" w:name="_Toc243590876"/>
+      <w:bookmarkStart w:id="34" w:name="_Toc243688713"/>
       <w:r>
         <w:t>8.5 Parámetros operativos</w:t>
       </w:r>
@@ -14233,13 +14159,56 @@
           </w:p>
         </w:tc>
       </w:tr>
+      <w:tr>
+        <w:trPr>
+          <w:cnfStyle w:val="000000100000" w:firstRow="0" w:lastRow="0" w:firstColumn="0" w:lastColumn="0" w:oddVBand="0" w:evenVBand="0" w:oddHBand="1" w:evenHBand="0" w:firstRowFirstColumn="0" w:firstRowLastColumn="0" w:lastRowFirstColumn="0" w:lastRowLastColumn="0"/>
+          <w:cantSplit/>
+          <w:jc w:val="center"/>
+        </w:trPr>
+        <w:tc>
+          <w:tcPr>
+            <w:cnfStyle w:val="001000000000" w:firstRow="0" w:lastRow="0" w:firstColumn="1" w:lastColumn="0" w:oddVBand="0" w:evenVBand="0" w:oddHBand="0" w:evenHBand="0" w:firstRowFirstColumn="0" w:firstRowLastColumn="0" w:lastRowFirstColumn="0" w:lastRowLastColumn="0"/>
+            <w:tcW w:w="3118" w:type="dxa"/>
+          </w:tcPr>
+          <w:p>
+            <w:pPr>
+              <w:spacing w:after="0"/>
+              <w:jc w:val="left"/>
+            </w:pPr>
+            <w:r>
+              <w:rPr>
+                <w:sz w:val="19"/>
+              </w:rPr>
+              <w:t>Capacidad del tanque de cada vehículo (para calcular el consumo de combustible)</w:t>
+            </w:r>
+          </w:p>
+        </w:tc>
+        <w:tc>
+          <w:tcPr>
+            <w:tcW w:w="5102" w:type="dxa"/>
+          </w:tcPr>
+          <w:p>
+            <w:pPr>
+              <w:spacing w:after="0"/>
+              <w:jc w:val="left"/>
+              <w:cnfStyle w:val="000000100000" w:firstRow="0" w:lastRow="0" w:firstColumn="0" w:lastColumn="0" w:oddVBand="0" w:evenVBand="0" w:oddHBand="1" w:evenHBand="0" w:firstRowFirstColumn="0" w:firstRowLastColumn="0" w:lastRowFirstColumn="0" w:lastRowLastColumn="0"/>
+            </w:pPr>
+            <w:r>
+              <w:rPr>
+                <w:sz w:val="19"/>
+              </w:rPr>
+              <w:t>Módulo Vehículos (Administrador o Logística).</w:t>
+            </w:r>
+          </w:p>
+        </w:tc>
+      </w:tr>
     </w:tbl>
     <w:p/>
     <w:p>
       <w:pPr>
         <w:pStyle w:val="Heading2"/>
       </w:pPr>
-      <w:bookmarkStart w:id="35" w:name="_Toc243590877"/>
+      <w:bookmarkStart w:id="35" w:name="_Toc243688714"/>
       <w:r>
         <w:t>8.6 Solución de problemas</w:t>
       </w:r>
@@ -14839,6 +14808,7 @@
               <w:rPr>
                 <w:sz w:val="19"/>
               </w:rPr>
+              <w:lastRenderedPageBreak/>
               <w:t>Error 403 al usar un módulo</w:t>
             </w:r>
           </w:p>
@@ -14900,7 +14870,6 @@
               <w:rPr>
                 <w:sz w:val="19"/>
               </w:rPr>
-              <w:lastRenderedPageBreak/>
               <w:t>El navegador no se conecta a la API</w:t>
             </w:r>
           </w:p>
@@ -15064,6 +15033,128 @@
           </w:p>
         </w:tc>
       </w:tr>
+      <w:tr>
+        <w:trPr>
+          <w:cnfStyle w:val="000000100000" w:firstRow="0" w:lastRow="0" w:firstColumn="0" w:lastColumn="0" w:oddVBand="0" w:evenVBand="0" w:oddHBand="1" w:evenHBand="0" w:firstRowFirstColumn="0" w:firstRowLastColumn="0" w:lastRowFirstColumn="0" w:lastRowLastColumn="0"/>
+          <w:cantSplit/>
+          <w:jc w:val="center"/>
+        </w:trPr>
+        <w:tc>
+          <w:tcPr>
+            <w:cnfStyle w:val="001000000000" w:firstRow="0" w:lastRow="0" w:firstColumn="1" w:lastColumn="0" w:oddVBand="0" w:evenVBand="0" w:oddHBand="0" w:evenHBand="0" w:firstRowFirstColumn="0" w:firstRowLastColumn="0" w:lastRowFirstColumn="0" w:lastRowLastColumn="0"/>
+            <w:tcW w:w="2268" w:type="dxa"/>
+          </w:tcPr>
+          <w:p>
+            <w:pPr>
+              <w:spacing w:after="0"/>
+              <w:jc w:val="left"/>
+            </w:pPr>
+            <w:r>
+              <w:rPr>
+                <w:sz w:val="19"/>
+              </w:rPr>
+              <w:t>La API no inicia: "JWT_SECRET no esta definido", "usa el valor de ejemplo" o "debe tener al menos 32 caracteres"</w:t>
+            </w:r>
+          </w:p>
+        </w:tc>
+        <w:tc>
+          <w:tcPr>
+            <w:tcW w:w="3402" w:type="dxa"/>
+          </w:tcPr>
+          <w:p>
+            <w:pPr>
+              <w:spacing w:after="0"/>
+              <w:jc w:val="left"/>
+              <w:cnfStyle w:val="000000100000" w:firstRow="0" w:lastRow="0" w:firstColumn="0" w:lastColumn="0" w:oddVBand="0" w:evenVBand="0" w:oddHBand="1" w:evenHBand="0" w:firstRowFirstColumn="0" w:firstRowLastColumn="0" w:lastRowFirstColumn="0" w:lastRowLastColumn="0"/>
+            </w:pPr>
+            <w:r>
+              <w:rPr>
+                <w:sz w:val="19"/>
+              </w:rPr>
+              <w:t>Falta JWT_SECRET en .env o es débil.</w:t>
+            </w:r>
+          </w:p>
+        </w:tc>
+        <w:tc>
+          <w:tcPr>
+            <w:tcW w:w="2550" w:type="dxa"/>
+          </w:tcPr>
+          <w:p>
+            <w:pPr>
+              <w:spacing w:after="0"/>
+              <w:jc w:val="left"/>
+              <w:cnfStyle w:val="000000100000" w:firstRow="0" w:lastRow="0" w:firstColumn="0" w:lastColumn="0" w:oddVBand="0" w:evenVBand="0" w:oddHBand="1" w:evenHBand="0" w:firstRowFirstColumn="0" w:firstRowLastColumn="0" w:lastRowFirstColumn="0" w:lastRowLastColumn="0"/>
+            </w:pPr>
+            <w:r>
+              <w:rPr>
+                <w:sz w:val="19"/>
+              </w:rPr>
+              <w:t>Generar una clave (sección 4.1), guardarla en .env y ejecutar pm2 restart yaneth-api.</w:t>
+            </w:r>
+          </w:p>
+        </w:tc>
+      </w:tr>
+      <w:tr>
+        <w:trPr>
+          <w:cnfStyle w:val="000000010000" w:firstRow="0" w:lastRow="0" w:firstColumn="0" w:lastColumn="0" w:oddVBand="0" w:evenVBand="0" w:oddHBand="0" w:evenHBand="1" w:firstRowFirstColumn="0" w:firstRowLastColumn="0" w:lastRowFirstColumn="0" w:lastRowLastColumn="0"/>
+          <w:cantSplit/>
+          <w:jc w:val="center"/>
+        </w:trPr>
+        <w:tc>
+          <w:tcPr>
+            <w:cnfStyle w:val="001000000000" w:firstRow="0" w:lastRow="0" w:firstColumn="1" w:lastColumn="0" w:oddVBand="0" w:evenVBand="0" w:oddHBand="0" w:evenHBand="0" w:firstRowFirstColumn="0" w:firstRowLastColumn="0" w:lastRowFirstColumn="0" w:lastRowLastColumn="0"/>
+            <w:tcW w:w="2268" w:type="dxa"/>
+          </w:tcPr>
+          <w:p>
+            <w:pPr>
+              <w:spacing w:after="0"/>
+              <w:jc w:val="left"/>
+            </w:pPr>
+            <w:r>
+              <w:rPr>
+                <w:sz w:val="19"/>
+              </w:rPr>
+              <w:t>Las entregas cerradas no muestran consumo ni rendimiento de combustible</w:t>
+            </w:r>
+          </w:p>
+        </w:tc>
+        <w:tc>
+          <w:tcPr>
+            <w:tcW w:w="3402" w:type="dxa"/>
+          </w:tcPr>
+          <w:p>
+            <w:pPr>
+              <w:spacing w:after="0"/>
+              <w:jc w:val="left"/>
+              <w:cnfStyle w:val="000000010000" w:firstRow="0" w:lastRow="0" w:firstColumn="0" w:lastColumn="0" w:oddVBand="0" w:evenVBand="0" w:oddHBand="0" w:evenHBand="1" w:firstRowFirstColumn="0" w:firstRowLastColumn="0" w:lastRowFirstColumn="0" w:lastRowLastColumn="0"/>
+            </w:pPr>
+            <w:r>
+              <w:rPr>
+                <w:sz w:val="19"/>
+              </w:rPr>
+              <w:t>El vehículo no tiene registrada la capacidad del tanque, o la entrega salió antes del control de combustible.</w:t>
+            </w:r>
+          </w:p>
+        </w:tc>
+        <w:tc>
+          <w:tcPr>
+            <w:tcW w:w="2550" w:type="dxa"/>
+          </w:tcPr>
+          <w:p>
+            <w:pPr>
+              <w:spacing w:after="0"/>
+              <w:jc w:val="left"/>
+              <w:cnfStyle w:val="000000010000" w:firstRow="0" w:lastRow="0" w:firstColumn="0" w:lastColumn="0" w:oddVBand="0" w:evenVBand="0" w:oddHBand="0" w:evenHBand="1" w:firstRowFirstColumn="0" w:firstRowLastColumn="0" w:lastRowFirstColumn="0" w:lastRowLastColumn="0"/>
+            </w:pPr>
+            <w:r>
+              <w:rPr>
+                <w:sz w:val="19"/>
+              </w:rPr>
+              <w:t>Registrar la capacidad en Vehículos; las entregas siguientes ya se calculan.</w:t>
+            </w:r>
+          </w:p>
+        </w:tc>
+      </w:tr>
     </w:tbl>
     <w:p/>
     <w:p>
@@ -15075,7 +15166,7 @@
       <w:pPr>
         <w:pStyle w:val="Heading2"/>
       </w:pPr>
-      <w:bookmarkStart w:id="36" w:name="_Toc243590878"/>
+      <w:bookmarkStart w:id="36" w:name="_Toc243688715"/>
       <w:r>
         <w:t>8.7 Buenas prácticas de seguridad</w:t>
       </w:r>
@@ -15141,7 +15232,7 @@
       <w:pPr>
         <w:pStyle w:val="Heading1"/>
       </w:pPr>
-      <w:bookmarkStart w:id="37" w:name="_Toc243590879"/>
+      <w:bookmarkStart w:id="37" w:name="_Toc243688716"/>
       <w:r>
         <w:t>Anexo A. Checklist de aceptación de la instalación</w:t>
       </w:r>
@@ -15157,10 +15248,7 @@
         <w:pStyle w:val="ListBullet"/>
       </w:pPr>
       <w:r>
-        <w:t>☐</w:t>
-      </w:r>
-      <w:r>
-        <w:t xml:space="preserve">  Variante de despliegue definida (A o B) e IP privada fija en cada servidor</w:t>
+        <w:t>☐  Variante de despliegue definida (A o B) e IP privada fija en cada servidor</w:t>
       </w:r>
     </w:p>
     <w:p>
@@ -15168,10 +15256,8 @@
         <w:pStyle w:val="ListBullet"/>
       </w:pPr>
       <w:r>
-        <w:t>☐</w:t>
-      </w:r>
-      <w:r>
-        <w:t xml:space="preserve">  Servidores con Ubuntu Server 24.04 actualizados</w:t>
+        <w:lastRenderedPageBreak/>
+        <w:t>☐  Servidores con Ubuntu Server 24.04 actualizados</w:t>
       </w:r>
     </w:p>
     <w:p>
@@ -15179,10 +15265,7 @@
         <w:pStyle w:val="ListBullet"/>
       </w:pPr>
       <w:r>
-        <w:t>☐</w:t>
-      </w:r>
-      <w:r>
-        <w:t xml:space="preserve">  MySQL y Redis instalados, con contraseña y escuchando solo donde corresponde</w:t>
+        <w:t>☐  MySQL y Redis instalados, con contraseña y escuchando solo donde corresponde</w:t>
       </w:r>
     </w:p>
     <w:p>
@@ -15190,10 +15273,7 @@
         <w:pStyle w:val="ListBullet"/>
       </w:pPr>
       <w:r>
-        <w:t>☐</w:t>
-      </w:r>
-      <w:r>
-        <w:t xml:space="preserve">  Node.js 22, PM2 y Nginx instalados en el servidor de aplicación</w:t>
+        <w:t>☐  Node.js 22, PM2 y Nginx instalados en el servidor de aplicación</w:t>
       </w:r>
     </w:p>
     <w:p>
@@ -15201,10 +15281,7 @@
         <w:pStyle w:val="ListBullet"/>
       </w:pPr>
       <w:r>
-        <w:t>☐</w:t>
-      </w:r>
-      <w:r>
-        <w:t xml:space="preserve">  Firewall configurado en cada servidor; 3000, 3306 y 6379 sin acceso desde Internet</w:t>
+        <w:t>☐  Firewall configurado en cada servidor; 3000, 3306 y 6379 sin acceso desde Internet</w:t>
       </w:r>
     </w:p>
     <w:p>
@@ -15212,10 +15289,7 @@
         <w:pStyle w:val="ListBullet"/>
       </w:pPr>
       <w:r>
-        <w:t>☐</w:t>
-      </w:r>
-      <w:r>
-        <w:t xml:space="preserve">  Conexión a MySQL y Redis probada desde el servidor de aplicación</w:t>
+        <w:t>☐  Conexión a MySQL y Redis probada desde el servidor de aplicación</w:t>
       </w:r>
     </w:p>
     <w:p>
@@ -15223,10 +15297,7 @@
         <w:pStyle w:val="ListBullet"/>
       </w:pPr>
       <w:r>
-        <w:t>☐</w:t>
-      </w:r>
-      <w:r>
-        <w:t xml:space="preserve">  Esquema creado (34 tablas) y administrador inicial registrado</w:t>
+        <w:t>☐  Esquema creado (34 tablas) y administrador inicial registrado</w:t>
       </w:r>
     </w:p>
     <w:p>
@@ -15234,10 +15305,7 @@
         <w:pStyle w:val="ListBullet"/>
       </w:pPr>
       <w:r>
-        <w:t>☐</w:t>
-      </w:r>
-      <w:r>
-        <w:t xml:space="preserve">  Variables de entorno configuradas con credenciales reales y JWT_SECRET propio</w:t>
+        <w:t>☐  Variables de entorno configuradas con credenciales reales y JWT_SECRET propio</w:t>
       </w:r>
     </w:p>
     <w:p>
@@ -15245,10 +15313,7 @@
         <w:pStyle w:val="ListBullet"/>
       </w:pPr>
       <w:r>
-        <w:t>☐</w:t>
-      </w:r>
-      <w:r>
-        <w:t xml:space="preserve">  API corriendo con PM2 y arranque automático</w:t>
+        <w:t>☐  API corriendo con PM2 y arranque automático</w:t>
       </w:r>
     </w:p>
     <w:p>
@@ -15256,10 +15321,7 @@
         <w:pStyle w:val="ListBullet"/>
       </w:pPr>
       <w:r>
-        <w:t>☐</w:t>
-      </w:r>
-      <w:r>
-        <w:t xml:space="preserve">  Frontend publicado por Nginx con HTTPS y renovación automática del certificado</w:t>
+        <w:t>☐  Frontend publicado por Nginx con HTTPS y renovación automática del certificado</w:t>
       </w:r>
     </w:p>
     <w:p>
@@ -15267,11 +15329,7 @@
         <w:pStyle w:val="ListBullet"/>
       </w:pPr>
       <w:r>
-        <w:lastRenderedPageBreak/>
-        <w:t>☐</w:t>
-      </w:r>
-      <w:r>
-        <w:t xml:space="preserve">  Respaldo automático configurado y restauración probada</w:t>
+        <w:t>☐  Respaldo automático configurado y restauración probada</w:t>
       </w:r>
     </w:p>
     <w:p>
@@ -15279,10 +15337,7 @@
         <w:pStyle w:val="ListBullet"/>
       </w:pPr>
       <w:r>
-        <w:t>☐</w:t>
-      </w:r>
-      <w:r>
-        <w:t xml:space="preserve">  Catálogos maestros y de producción cargados</w:t>
+        <w:t>☐  Catálogos maestros y de producción cargados</w:t>
       </w:r>
     </w:p>
     <w:p>
@@ -15290,10 +15345,7 @@
         <w:pStyle w:val="ListBullet"/>
       </w:pPr>
       <w:r>
-        <w:t>☐</w:t>
-      </w:r>
-      <w:r>
-        <w:t xml:space="preserve">  Usuarios reales dados de alta con su rol</w:t>
+        <w:t>☐  Usuarios reales dados de alta con su rol</w:t>
       </w:r>
     </w:p>
     <w:p>
@@ -15301,10 +15353,7 @@
         <w:pStyle w:val="ListBullet"/>
       </w:pPr>
       <w:r>
-        <w:t>☐</w:t>
-      </w:r>
-      <w:r>
-        <w:t xml:space="preserve">  Prueba de aceptación por módulo sin observaciones abiertas</w:t>
+        <w:t>☐  Prueba de aceptación por módulo sin observaciones abiertas</w:t>
       </w:r>
     </w:p>
     <w:p>
@@ -15312,10 +15361,7 @@
         <w:pStyle w:val="ListBullet"/>
       </w:pPr>
       <w:r>
-        <w:t>☐</w:t>
-      </w:r>
-      <w:r>
-        <w:t xml:space="preserve">  Tiempos de respuesta verificados (&lt; 3 s)</w:t>
+        <w:t>☐  Tiempos de respuesta verificados (&lt; 3 s)</w:t>
       </w:r>
     </w:p>
     <w:p/>
@@ -15328,7 +15374,7 @@
       <w:pPr>
         <w:pStyle w:val="Heading1"/>
       </w:pPr>
-      <w:bookmarkStart w:id="38" w:name="_Toc243590880"/>
+      <w:bookmarkStart w:id="38" w:name="_Toc243688717"/>
       <w:r>
         <w:t>Anexo B. Instalación local para desarrollo</w:t>
       </w:r>
@@ -15343,7 +15389,7 @@
       <w:pPr>
         <w:pStyle w:val="Heading2"/>
       </w:pPr>
-      <w:bookmarkStart w:id="39" w:name="_Toc243590881"/>
+      <w:bookmarkStart w:id="39" w:name="_Toc243688718"/>
       <w:r>
         <w:t>B.1 Requisitos</w:t>
       </w:r>
@@ -15377,7 +15423,7 @@
       <w:pPr>
         <w:pStyle w:val="Heading2"/>
       </w:pPr>
-      <w:bookmarkStart w:id="40" w:name="_Toc243590882"/>
+      <w:bookmarkStart w:id="40" w:name="_Toc243688719"/>
       <w:r>
         <w:t>B.2 Base de datos y Redis</w:t>
       </w:r>
@@ -15433,8 +15479,9 @@
       <w:pPr>
         <w:pStyle w:val="Heading2"/>
       </w:pPr>
-      <w:bookmarkStart w:id="41" w:name="_Toc243590883"/>
-      <w:r>
+      <w:bookmarkStart w:id="41" w:name="_Toc243688720"/>
+      <w:r>
+        <w:lastRenderedPageBreak/>
         <w:t>B.3 Backend</w:t>
       </w:r>
       <w:bookmarkEnd w:id="41"/>
@@ -15478,13 +15525,6 @@
           <w:sz w:val="19"/>
         </w:rPr>
         <w:br/>
-      </w:r>
-      <w:r>
-        <w:rPr>
-          <w:rFonts w:ascii="Consolas" w:hAnsi="Consolas"/>
-          <w:color w:val="1F1F1F"/>
-          <w:sz w:val="19"/>
-        </w:rPr>
         <w:t>cp .env.example .env          # en Windows (cmd): copy .env.example .env</w:t>
       </w:r>
       <w:r>
@@ -15510,9 +15550,8 @@
       <w:pPr>
         <w:pStyle w:val="Heading2"/>
       </w:pPr>
-      <w:bookmarkStart w:id="42" w:name="_Toc243590884"/>
-      <w:r>
-        <w:lastRenderedPageBreak/>
+      <w:bookmarkStart w:id="42" w:name="_Toc243688721"/>
+      <w:r>
         <w:t>B.4 Frontend</w:t>
       </w:r>
       <w:bookmarkEnd w:id="42"/>
@@ -15577,7 +15616,7 @@
       <w:pPr>
         <w:pStyle w:val="Heading2"/>
       </w:pPr>
-      <w:bookmarkStart w:id="43" w:name="_Toc243590885"/>
+      <w:bookmarkStart w:id="43" w:name="_Toc243688722"/>
       <w:r>
         <w:t>B.5 Diferencias con producción</w:t>
       </w:r>

</xml_diff>